<commit_message>
Aufgaben Done inkl Doku
</commit_message>
<xml_diff>
--- a/Planungsdokumente/P1_G1_Themen-Planungsdokument_Luca_Kiril.docx
+++ b/Planungsdokumente/P1_G1_Themen-Planungsdokument_Luca_Kiril.docx
@@ -1,6 +1,6 @@
 
 <file path=word/document.xml><?xml version="1.0" encoding="utf-8"?>
-<w:document xmlns:wpc="http://schemas.microsoft.com/office/word/2010/wordprocessingCanvas" xmlns:cx="http://schemas.microsoft.com/office/drawing/2014/chartex" xmlns:cx1="http://schemas.microsoft.com/office/drawing/2015/9/8/chartex" xmlns:cx2="http://schemas.microsoft.com/office/drawing/2015/10/21/chartex" xmlns:cx3="http://schemas.microsoft.com/office/drawing/2016/5/9/chartex" xmlns:cx4="http://schemas.microsoft.com/office/drawing/2016/5/10/chartex" xmlns:cx5="http://schemas.microsoft.com/office/drawing/2016/5/11/chartex" xmlns:cx6="http://schemas.microsoft.com/office/drawing/2016/5/12/chartex" xmlns:cx7="http://schemas.microsoft.com/office/drawing/2016/5/13/chartex" xmlns:cx8="http://schemas.microsoft.com/office/drawing/2016/5/14/chartex" xmlns:mc="http://schemas.openxmlformats.org/markup-compatibility/2006" xmlns:aink="http://schemas.microsoft.com/office/drawing/2016/ink" xmlns:am3d="http://schemas.microsoft.com/office/drawing/2017/model3d" xmlns:o="urn:schemas-microsoft-com:office:office" xmlns:oel="http://schemas.microsoft.com/office/2019/extlst" xmlns:r="http://schemas.openxmlformats.org/officeDocument/2006/relationships" xmlns:m="http://schemas.openxmlformats.org/officeDocument/2006/math" xmlns:v="urn:schemas-microsoft-com:vml" xmlns:wp14="http://schemas.microsoft.com/office/word/2010/wordprocessingDrawing" xmlns:wp="http://schemas.openxmlformats.org/drawingml/2006/wordprocessingDrawing" xmlns:w10="urn:schemas-microsoft-com:office:word" xmlns:w="http://schemas.openxmlformats.org/wordprocessingml/2006/main" xmlns:w14="http://schemas.microsoft.com/office/word/2010/wordml" xmlns:w15="http://schemas.microsoft.com/office/word/2012/wordml" xmlns:w16cex="http://schemas.microsoft.com/office/word/2018/wordml/cex" xmlns:w16cid="http://schemas.microsoft.com/office/word/2016/wordml/cid" xmlns:w16="http://schemas.microsoft.com/office/word/2018/wordml" xmlns:w16du="http://schemas.microsoft.com/office/word/2023/wordml/word16du" xmlns:w16sdtdh="http://schemas.microsoft.com/office/word/2020/wordml/sdtdatahash" xmlns:w16sdtfl="http://schemas.microsoft.com/office/word/2024/wordml/sdtformatlock" xmlns:w16se="http://schemas.microsoft.com/office/word/2015/wordml/symex" xmlns:wpg="http://schemas.microsoft.com/office/word/2010/wordprocessingGroup" xmlns:wpi="http://schemas.microsoft.com/office/word/2010/wordprocessingInk" xmlns:wne="http://schemas.microsoft.com/office/word/2006/wordml" xmlns:wps="http://schemas.microsoft.com/office/word/2010/wordprocessingShape" mc:Ignorable="w14 w15 w16se w16cid w16 w16cex w16sdtdh w16sdtfl w16du wp14">
+<w:document xmlns:wpc="http://schemas.microsoft.com/office/word/2010/wordprocessingCanvas" xmlns:cx="http://schemas.microsoft.com/office/drawing/2014/chartex" xmlns:cx1="http://schemas.microsoft.com/office/drawing/2015/9/8/chartex" xmlns:cx2="http://schemas.microsoft.com/office/drawing/2015/10/21/chartex" xmlns:cx3="http://schemas.microsoft.com/office/drawing/2016/5/9/chartex" xmlns:cx4="http://schemas.microsoft.com/office/drawing/2016/5/10/chartex" xmlns:cx5="http://schemas.microsoft.com/office/drawing/2016/5/11/chartex" xmlns:cx6="http://schemas.microsoft.com/office/drawing/2016/5/12/chartex" xmlns:cx7="http://schemas.microsoft.com/office/drawing/2016/5/13/chartex" xmlns:cx8="http://schemas.microsoft.com/office/drawing/2016/5/14/chartex" xmlns:mc="http://schemas.openxmlformats.org/markup-compatibility/2006" xmlns:m="http://schemas.openxmlformats.org/officeDocument/2006/math" xmlns:aink="http://schemas.microsoft.com/office/drawing/2016/ink" xmlns:am3d="http://schemas.microsoft.com/office/drawing/2017/model3d" xmlns:oel="http://schemas.microsoft.com/office/2019/extlst" xmlns:r="http://schemas.openxmlformats.org/officeDocument/2006/relationships" xmlns:wp14="http://schemas.microsoft.com/office/word/2010/wordprocessingDrawing" xmlns:wp="http://schemas.openxmlformats.org/drawingml/2006/wordprocessingDrawing" xmlns:wpg="http://schemas.microsoft.com/office/word/2010/wordprocessingGroup" xmlns:wpi="http://schemas.microsoft.com/office/word/2010/wordprocessingInk" xmlns:wps="http://schemas.microsoft.com/office/word/2010/wordprocessingShape" xmlns:o="urn:schemas-microsoft-com:office:office" xmlns:v="urn:schemas-microsoft-com:vml" xmlns:w10="urn:schemas-microsoft-com:office:word" xmlns:w="http://schemas.openxmlformats.org/wordprocessingml/2006/main" xmlns:w14="http://schemas.microsoft.com/office/word/2010/wordml" xmlns:w15="http://schemas.microsoft.com/office/word/2012/wordml" xmlns:w16cex="http://schemas.microsoft.com/office/word/2018/wordml/cex" xmlns:w16cid="http://schemas.microsoft.com/office/word/2016/wordml/cid" xmlns:w16="http://schemas.microsoft.com/office/word/2018/wordml" xmlns:w16sdtdh="http://schemas.microsoft.com/office/word/2020/wordml/sdtdatahash" xmlns:w16sdtfl="http://schemas.microsoft.com/office/word/2024/wordml/sdtformatlock" xmlns:w16se="http://schemas.microsoft.com/office/word/2015/wordml/symex" xmlns:w16du="http://schemas.microsoft.com/office/word/2023/wordml/word16du" xmlns:wne="http://schemas.microsoft.com/office/word/2006/wordml" mc:Ignorable="w14 w15 w16se w16cid w16 w16cex w16sdtdh w16sdtfl w16du wp14">
   <w:body>
     <w:p>
       <w:pPr>
@@ -58,8 +58,8 @@
         <w:tblLook w:val="07E0" w:firstRow="1" w:lastRow="1" w:firstColumn="1" w:lastColumn="1" w:noHBand="1" w:noVBand="1"/>
       </w:tblPr>
       <w:tblGrid>
-        <w:gridCol w:w="2607"/>
-        <w:gridCol w:w="5545"/>
+        <w:gridCol w:w="2430"/>
+        <w:gridCol w:w="5722"/>
       </w:tblGrid>
       <w:tr>
         <w:tc>
@@ -265,8 +265,13 @@
         <w:rPr>
           <w:noProof/>
         </w:rPr>
-        <w:pict w14:anchorId="175010CE">
-          <v:rect id="_x0000_i1025" alt="" style="width:347pt;height:.05pt;mso-width-percent:0;mso-height-percent:0;mso-width-percent:0;mso-height-percent:0" o:hrpct="765" o:hralign="center" o:hrstd="t" o:hr="t"/>
+      </w:r>
+      <w:r>
+        <w:pict w14:anchorId="58026FF8">
+          <v:rect id="Horizontal Line 1" o:spid="_x0000_s2054" style="width:303.55pt;height:.05pt;visibility:visible;mso-wrap-style:square;mso-left-percent:-10001;mso-top-percent:-10001;mso-position-horizontal:absolute;mso-position-horizontal-relative:char;mso-position-vertical:absolute;mso-position-vertical-relative:line;mso-left-percent:-10001;mso-top-percent:-10001;v-text-anchor:top" o:gfxdata="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" filled="f">
+            <o:lock v:ext="edit" rotation="t" aspectratio="t" verticies="t" text="t" shapetype="t"/>
+            <w10:anchorlock/>
+          </v:rect>
         </w:pict>
       </w:r>
     </w:p>
@@ -1031,8 +1036,13 @@
         <w:rPr>
           <w:noProof/>
         </w:rPr>
-        <w:pict w14:anchorId="478310B2">
-          <v:rect id="_x0000_i1026" alt="" style="width:347pt;height:.05pt;mso-width-percent:0;mso-height-percent:0;mso-width-percent:0;mso-height-percent:0" o:hrpct="765" o:hralign="center" o:hrstd="t" o:hr="t"/>
+      </w:r>
+      <w:r>
+        <w:pict w14:anchorId="48CD6E9A">
+          <v:rect id="Horizontal Line 2" o:spid="_x0000_s2053" style="width:303.55pt;height:.05pt;visibility:visible;mso-wrap-style:square;mso-left-percent:-10001;mso-top-percent:-10001;mso-position-horizontal:absolute;mso-position-horizontal-relative:char;mso-position-vertical:absolute;mso-position-vertical-relative:line;mso-left-percent:-10001;mso-top-percent:-10001;v-text-anchor:top" o:gfxdata="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" filled="f">
+            <o:lock v:ext="edit" rotation="t" aspectratio="t" verticies="t" text="t" shapetype="t"/>
+            <w10:anchorlock/>
+          </v:rect>
         </w:pict>
       </w:r>
     </w:p>
@@ -1187,23 +1197,9 @@
     </w:p>
     <w:p>
       <w:pPr>
-        <w:spacing w:line="280" w:lineRule="exact"/>
-        <w:rPr>
-          <w:rFonts w:ascii="Dosis" w:eastAsiaTheme="majorEastAsia" w:hAnsi="Dosis" w:cstheme="majorBidi"/>
-          <w:sz w:val="56"/>
-          <w:szCs w:val="26"/>
-        </w:rPr>
-      </w:pPr>
-      <w:r>
-        <w:br w:type="page"/>
-      </w:r>
-    </w:p>
-    <w:p>
-      <w:pPr>
         <w:pStyle w:val="berschrift2"/>
       </w:pPr>
       <w:r>
-        <w:lastRenderedPageBreak/>
         <w:t>P2 - Während der Arbeit (Arbeitsprotokoll)</w:t>
       </w:r>
       <w:bookmarkEnd w:id="10"/>
@@ -1222,10 +1218,10 @@
         <w:tblLook w:val="07E0" w:firstRow="1" w:lastRow="1" w:firstColumn="1" w:lastColumn="1" w:noHBand="1" w:noVBand="1"/>
       </w:tblPr>
       <w:tblGrid>
-        <w:gridCol w:w="1511"/>
-        <w:gridCol w:w="2606"/>
-        <w:gridCol w:w="2150"/>
-        <w:gridCol w:w="1885"/>
+        <w:gridCol w:w="1121"/>
+        <w:gridCol w:w="2345"/>
+        <w:gridCol w:w="2875"/>
+        <w:gridCol w:w="1811"/>
       </w:tblGrid>
       <w:tr>
         <w:tc>
@@ -1290,25 +1286,41 @@
           <w:tcPr>
             <w:tcW w:w="0" w:type="auto"/>
           </w:tcPr>
-          <w:p/>
-        </w:tc>
-        <w:tc>
-          <w:tcPr>
-            <w:tcW w:w="0" w:type="auto"/>
-          </w:tcPr>
-          <w:p/>
-        </w:tc>
-        <w:tc>
-          <w:tcPr>
-            <w:tcW w:w="0" w:type="auto"/>
-          </w:tcPr>
-          <w:p/>
-        </w:tc>
-        <w:tc>
-          <w:tcPr>
-            <w:tcW w:w="0" w:type="auto"/>
-          </w:tcPr>
-          <w:p/>
+          <w:p>
+            <w:r>
+              <w:t>13.09.2026</w:t>
+            </w:r>
+          </w:p>
+        </w:tc>
+        <w:tc>
+          <w:tcPr>
+            <w:tcW w:w="0" w:type="auto"/>
+          </w:tcPr>
+          <w:p>
+            <w:r>
+              <w:t>Arbeitsblatt G1 gemeinsam durchgearbeitet und das Konsolenprojekt in Rider angelegt.</w:t>
+            </w:r>
+          </w:p>
+        </w:tc>
+        <w:tc>
+          <w:tcPr>
+            <w:tcW w:w="0" w:type="auto"/>
+          </w:tcPr>
+          <w:p>
+            <w:r>
+              <w:t>Der Create-Button blieb grau, weil auf dem Mac kein .NET SDK installiert war.</w:t>
+            </w:r>
+          </w:p>
+        </w:tc>
+        <w:tc>
+          <w:tcPr>
+            <w:tcW w:w="0" w:type="auto"/>
+          </w:tcPr>
+          <w:p>
+            <w:r>
+              <w:t>SDK installieren, Rider neu starten, Projekt erstellen.</w:t>
+            </w:r>
+          </w:p>
         </w:tc>
       </w:tr>
       <w:tr>
@@ -1316,25 +1328,41 @@
           <w:tcPr>
             <w:tcW w:w="0" w:type="auto"/>
           </w:tcPr>
-          <w:p/>
-        </w:tc>
-        <w:tc>
-          <w:tcPr>
-            <w:tcW w:w="0" w:type="auto"/>
-          </w:tcPr>
-          <w:p/>
-        </w:tc>
-        <w:tc>
-          <w:tcPr>
-            <w:tcW w:w="0" w:type="auto"/>
-          </w:tcPr>
-          <w:p/>
-        </w:tc>
-        <w:tc>
-          <w:tcPr>
-            <w:tcW w:w="0" w:type="auto"/>
-          </w:tcPr>
-          <w:p/>
+          <w:p>
+            <w:r>
+              <w:t>13.09.2026</w:t>
+            </w:r>
+          </w:p>
+        </w:tc>
+        <w:tc>
+          <w:tcPr>
+            <w:tcW w:w="0" w:type="auto"/>
+          </w:tcPr>
+          <w:p>
+            <w:r>
+              <w:t>Ein Git-Repository aufgesetzt, damit wir den Code zu zweit teilen können.</w:t>
+            </w:r>
+          </w:p>
+        </w:tc>
+        <w:tc>
+          <w:tcPr>
+            <w:tcW w:w="0" w:type="auto"/>
+          </w:tcPr>
+          <w:p>
+            <w:r>
+              <w:t>Wir haben entschieden, auch dieses Planungsdokument im Repository abzulegen, damit Code und Planung am selben Ort liegen und beide denselben Stand sehen.</w:t>
+            </w:r>
+          </w:p>
+        </w:tc>
+        <w:tc>
+          <w:tcPr>
+            <w:tcW w:w="0" w:type="auto"/>
+          </w:tcPr>
+          <w:p>
+            <w:r>
+              <w:t>Mit dem Buch-Beispiel aus dem Arbeitsblatt starten.</w:t>
+            </w:r>
+          </w:p>
         </w:tc>
       </w:tr>
       <w:tr>
@@ -1342,25 +1370,41 @@
           <w:tcPr>
             <w:tcW w:w="0" w:type="auto"/>
           </w:tcPr>
-          <w:p/>
-        </w:tc>
-        <w:tc>
-          <w:tcPr>
-            <w:tcW w:w="0" w:type="auto"/>
-          </w:tcPr>
-          <w:p/>
-        </w:tc>
-        <w:tc>
-          <w:tcPr>
-            <w:tcW w:w="0" w:type="auto"/>
-          </w:tcPr>
-          <w:p/>
-        </w:tc>
-        <w:tc>
-          <w:tcPr>
-            <w:tcW w:w="0" w:type="auto"/>
-          </w:tcPr>
-          <w:p/>
+          <w:p>
+            <w:r>
+              <w:t>13.09.2026</w:t>
+            </w:r>
+          </w:p>
+        </w:tc>
+        <w:tc>
+          <w:tcPr>
+            <w:tcW w:w="0" w:type="auto"/>
+          </w:tcPr>
+          <w:p>
+            <w:r>
+              <w:t>Aufgabe 1 zuerst selbst getippt, vor allem Luca. Kiril hat den Aufbau erklärt und den Code gegengelesen.</w:t>
+            </w:r>
+          </w:p>
+        </w:tc>
+        <w:tc>
+          <w:tcPr>
+            <w:tcW w:w="0" w:type="auto"/>
+          </w:tcPr>
+          <w:p>
+            <w:r>
+              <w:t>Selber tippen war zäher als abschreiben, hat aber gezeigt, wo wir den Aufbau noch nicht verstanden hatten. Die Klasse ist die Vorlage, jede Instanz hält eigene Werte.</w:t>
+            </w:r>
+          </w:p>
+        </w:tc>
+        <w:tc>
+          <w:tcPr>
+            <w:tcW w:w="0" w:type="auto"/>
+          </w:tcPr>
+          <w:p>
+            <w:r>
+              <w:t>Aufgabe 2 mit Listen lösen.</w:t>
+            </w:r>
+          </w:p>
         </w:tc>
       </w:tr>
       <w:tr>
@@ -1368,25 +1412,41 @@
           <w:tcPr>
             <w:tcW w:w="0" w:type="auto"/>
           </w:tcPr>
-          <w:p/>
-        </w:tc>
-        <w:tc>
-          <w:tcPr>
-            <w:tcW w:w="0" w:type="auto"/>
-          </w:tcPr>
-          <w:p/>
-        </w:tc>
-        <w:tc>
-          <w:tcPr>
-            <w:tcW w:w="0" w:type="auto"/>
-          </w:tcPr>
-          <w:p/>
-        </w:tc>
-        <w:tc>
-          <w:tcPr>
-            <w:tcW w:w="0" w:type="auto"/>
-          </w:tcPr>
-          <w:p/>
+          <w:p>
+            <w:r>
+              <w:t>13.09.2026</w:t>
+            </w:r>
+          </w:p>
+        </w:tc>
+        <w:tc>
+          <w:tcPr>
+            <w:tcW w:w="0" w:type="auto"/>
+          </w:tcPr>
+          <w:p>
+            <w:r>
+              <w:t>Aufgabe 2: Zoo mit Käfig, Tier und Pfleger abgebildet, mehrere Instanzen je Typ.</w:t>
+            </w:r>
+          </w:p>
+        </w:tc>
+        <w:tc>
+          <w:tcPr>
+            <w:tcW w:w="0" w:type="auto"/>
+          </w:tcPr>
+          <w:p>
+            <w:r>
+              <w:t>Ein einzelner Pfleger ist ein normales Feld, mehrere Tiere brauchen eine Liste. Die Liste muss vor dem ersten Add erzeugt werden, sonst bricht das Programm ab.</w:t>
+            </w:r>
+          </w:p>
+        </w:tc>
+        <w:tc>
+          <w:tcPr>
+            <w:tcW w:w="0" w:type="auto"/>
+          </w:tcPr>
+          <w:p>
+            <w:r>
+              <w:t>Den eigenen Code zum Laufen bringen.</w:t>
+            </w:r>
+          </w:p>
         </w:tc>
       </w:tr>
       <w:tr>
@@ -1394,25 +1454,168 @@
           <w:tcPr>
             <w:tcW w:w="0" w:type="auto"/>
           </w:tcPr>
-          <w:p/>
-        </w:tc>
-        <w:tc>
-          <w:tcPr>
-            <w:tcW w:w="0" w:type="auto"/>
-          </w:tcPr>
-          <w:p/>
-        </w:tc>
-        <w:tc>
-          <w:tcPr>
-            <w:tcW w:w="0" w:type="auto"/>
-          </w:tcPr>
-          <w:p/>
-        </w:tc>
-        <w:tc>
-          <w:tcPr>
-            <w:tcW w:w="0" w:type="auto"/>
-          </w:tcPr>
-          <w:p/>
+          <w:p>
+            <w:r>
+              <w:t>13.09.2026</w:t>
+            </w:r>
+          </w:p>
+        </w:tc>
+        <w:tc>
+          <w:tcPr>
+            <w:tcW w:w="0" w:type="auto"/>
+          </w:tcPr>
+          <w:p>
+            <w:r>
+              <w:t>Fehler im selbst geschriebenen Code gesucht und behoben. Danach den laufenden Code von KI gegenchecken und ausbessern lassen.</w:t>
+            </w:r>
+          </w:p>
+        </w:tc>
+        <w:tc>
+          <w:tcPr>
+            <w:tcW w:w="0" w:type="auto"/>
+          </w:tcPr>
+          <w:p>
+            <w:r>
+              <w:t>Erst nach dem Beheben lief das Programm. Die Logik stand da schon, die KI hat vor allem bei Namensgebung und Aufbau nachgebessert. Wichtig war die Reihenfolge: zuerst selbst, dann prüfen lassen.</w:t>
+            </w:r>
+          </w:p>
+        </w:tc>
+        <w:tc>
+          <w:tcPr>
+            <w:tcW w:w="0" w:type="auto"/>
+          </w:tcPr>
+          <w:p>
+            <w:r>
+              <w:t>Eigenes Fallbeispiel entwerfen und skizzieren.</w:t>
+            </w:r>
+          </w:p>
+        </w:tc>
+      </w:tr>
+      <w:tr>
+        <w:tc>
+          <w:tcPr>
+            <w:tcW w:w="0" w:type="auto"/>
+          </w:tcPr>
+          <w:p>
+            <w:r>
+              <w:t>13.09.2026</w:t>
+            </w:r>
+          </w:p>
+        </w:tc>
+        <w:tc>
+          <w:tcPr>
+            <w:tcW w:w="0" w:type="auto"/>
+          </w:tcPr>
+          <w:p>
+            <w:r>
+              <w:t>Aufgabe 3 und 4: eigenes Fallbeispiel Fahrschule mit fünf Klassen, zuerst mit Feldern, danach dieselben Klassen mit Eigenschaften.</w:t>
+            </w:r>
+          </w:p>
+        </w:tc>
+        <w:tc>
+          <w:tcPr>
+            <w:tcW w:w="0" w:type="auto"/>
+          </w:tcPr>
+          <w:p>
+            <w:r>
+              <w:t>Der Nutzen von Eigenschaften wurde erst im direkten Vergleich sichtbar. Ein Feld hätte einen negativen Kilometerstand kommentarlos gespeichert, der Setter lehnt ihn ab.</w:t>
+            </w:r>
+          </w:p>
+        </w:tc>
+        <w:tc>
+          <w:tcPr>
+            <w:tcW w:w="0" w:type="auto"/>
+          </w:tcPr>
+          <w:p>
+            <w:r>
+              <w:t>Aufgabe 5 bis 7 umsetzen.</w:t>
+            </w:r>
+          </w:p>
+        </w:tc>
+      </w:tr>
+      <w:tr>
+        <w:tc>
+          <w:tcPr>
+            <w:tcW w:w="0" w:type="auto"/>
+          </w:tcPr>
+          <w:p>
+            <w:r>
+              <w:lastRenderedPageBreak/>
+              <w:t>13.09.2026</w:t>
+            </w:r>
+          </w:p>
+        </w:tc>
+        <w:tc>
+          <w:tcPr>
+            <w:tcW w:w="0" w:type="auto"/>
+          </w:tcPr>
+          <w:p>
+            <w:r>
+              <w:t>Aufgabe 5 bis 7: Erfassung über die Konsole, byValue gegen byReference, Speichern und Laden als JSON.</w:t>
+            </w:r>
+          </w:p>
+        </w:tc>
+        <w:tc>
+          <w:tcPr>
+            <w:tcW w:w="0" w:type="auto"/>
+          </w:tcPr>
+          <w:p>
+            <w:r>
+              <w:t>Console.ReadLine liefert immer Text, Zahlen müssen umgewandelt werden. System.Text.Json überspringt Felder, ohne die Option IncludeFields kam ein leeres Objekt heraus.</w:t>
+            </w:r>
+          </w:p>
+        </w:tc>
+        <w:tc>
+          <w:tcPr>
+            <w:tcW w:w="0" w:type="auto"/>
+          </w:tcPr>
+          <w:p>
+            <w:r>
+              <w:t>Datumstyp im ganzen Projekt vereinheitlichen.</w:t>
+            </w:r>
+          </w:p>
+        </w:tc>
+      </w:tr>
+      <w:tr>
+        <w:tc>
+          <w:tcPr>
+            <w:tcW w:w="0" w:type="auto"/>
+          </w:tcPr>
+          <w:p>
+            <w:r>
+              <w:t>13.09.2026</w:t>
+            </w:r>
+          </w:p>
+        </w:tc>
+        <w:tc>
+          <w:tcPr>
+            <w:tcW w:w="0" w:type="auto"/>
+          </w:tcPr>
+          <w:p>
+            <w:r>
+              <w:t>Datumstyp auf DateTimeOffset umgestellt, Code aufgeräumt und das UML-Klassendiagramm per Reverse Engineering erzeugt.</w:t>
+            </w:r>
+          </w:p>
+        </w:tc>
+        <w:tc>
+          <w:tcPr>
+            <w:tcW w:w="0" w:type="auto"/>
+          </w:tcPr>
+          <w:p>
+            <w:r>
+              <w:t>Halb umgestellter Code brach den Build mit zwei Compilerfehlern. Der Weg über das Diagrammwerkzeug von Rider führte zweimal ins Leere, das Diagramm entstand am Ende über ein anderes Werkzeug.</w:t>
+            </w:r>
+          </w:p>
+        </w:tc>
+        <w:tc>
+          <w:tcPr>
+            <w:tcW w:w="0" w:type="auto"/>
+          </w:tcPr>
+          <w:p>
+            <w:r>
+              <w:t>P2 und P3 ausfüllen, Abgabe vollständig prüfen.</w:t>
+            </w:r>
+          </w:p>
         </w:tc>
       </w:tr>
     </w:tbl>
@@ -1421,8 +1624,13 @@
         <w:rPr>
           <w:noProof/>
         </w:rPr>
-        <w:pict w14:anchorId="740F16F2">
-          <v:rect id="_x0000_i1027" alt="" style="width:347pt;height:.05pt;mso-width-percent:0;mso-height-percent:0;mso-width-percent:0;mso-height-percent:0" o:hrpct="765" o:hralign="center" o:hrstd="t" o:hr="t"/>
+      </w:r>
+      <w:r>
+        <w:pict w14:anchorId="0114278C">
+          <v:rect id="Horizontal Line 3" o:spid="_x0000_s2052" style="width:303.55pt;height:.05pt;visibility:visible;mso-wrap-style:square;mso-left-percent:-10001;mso-top-percent:-10001;mso-position-horizontal:absolute;mso-position-horizontal-relative:char;mso-position-vertical:absolute;mso-position-vertical-relative:line;mso-left-percent:-10001;mso-top-percent:-10001;v-text-anchor:top" o:gfxdata="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" filled="f">
+            <o:lock v:ext="edit" rotation="t" aspectratio="t" verticies="t" text="t" shapetype="t"/>
+            <w10:anchorlock/>
+          </v:rect>
         </w:pict>
       </w:r>
     </w:p>
@@ -1595,9 +1803,9 @@
         <w:tblLook w:val="07E0" w:firstRow="1" w:lastRow="1" w:firstColumn="1" w:lastColumn="1" w:noHBand="1" w:noVBand="1"/>
       </w:tblPr>
       <w:tblGrid>
-        <w:gridCol w:w="2241"/>
-        <w:gridCol w:w="2284"/>
-        <w:gridCol w:w="3627"/>
+        <w:gridCol w:w="1125"/>
+        <w:gridCol w:w="1154"/>
+        <w:gridCol w:w="5873"/>
       </w:tblGrid>
       <w:tr>
         <w:tc>
@@ -1660,15 +1868,19 @@
           </w:tcPr>
           <w:p>
             <w:r>
-              <w:t>⬜ ja ⬜ teilw. ⬜ nein</w:t>
-            </w:r>
-          </w:p>
-        </w:tc>
-        <w:tc>
-          <w:tcPr>
-            <w:tcW w:w="0" w:type="auto"/>
-          </w:tcPr>
-          <w:p/>
+              <w:t>☒ ja ⬜ teilw. ⬜ nein</w:t>
+            </w:r>
+          </w:p>
+        </w:tc>
+        <w:tc>
+          <w:tcPr>
+            <w:tcW w:w="0" w:type="auto"/>
+          </w:tcPr>
+          <w:p>
+            <w:r>
+              <w:t>Ordner Aufgabe1_Buch und Aufgabe2_Zoo. Die Klasse Buch hat Felder mit Zugriffstyp, Datentyp und Name, im Hauptprogramm entstehen mehrere Objekte mit je eigenen Werten. Der erste Entwurf stammt von uns selbst, das Projekt läuft fehlerfrei.</w:t>
+            </w:r>
+          </w:p>
         </w:tc>
       </w:tr>
       <w:tr>
@@ -1688,15 +1900,19 @@
           </w:tcPr>
           <w:p>
             <w:r>
-              <w:t>⬜ ja ⬜ teilw. ⬜ nein</w:t>
-            </w:r>
-          </w:p>
-        </w:tc>
-        <w:tc>
-          <w:tcPr>
-            <w:tcW w:w="0" w:type="auto"/>
-          </w:tcPr>
-          <w:p/>
+              <w:t>☒ ja ⬜ teilw. ⬜ nein</w:t>
+            </w:r>
+          </w:p>
+        </w:tc>
+        <w:tc>
+          <w:tcPr>
+            <w:tcW w:w="0" w:type="auto"/>
+          </w:tcPr>
+          <w:p>
+            <w:r>
+              <w:t>Aufgabe 6 zeigt den Unterschied am eigenen Beispiel: y = x kopiert bei einem Werttyp den Wert, während buch2 = buch1 nur die Adresse kopiert und beide Variablen auf dasselbe Objekt zeigen. Wir haben uns die Erklärung gegenseitig abgenommen.</w:t>
+            </w:r>
+          </w:p>
         </w:tc>
       </w:tr>
       <w:tr>
@@ -1716,15 +1932,19 @@
           </w:tcPr>
           <w:p>
             <w:r>
-              <w:t>⬜ ja ⬜ teilw. ⬜ nein</w:t>
-            </w:r>
-          </w:p>
-        </w:tc>
-        <w:tc>
-          <w:tcPr>
-            <w:tcW w:w="0" w:type="auto"/>
-          </w:tcPr>
-          <w:p/>
+              <w:t>☒ ja ⬜ teilw. ⬜ nein</w:t>
+            </w:r>
+          </w:p>
+        </w:tc>
+        <w:tc>
+          <w:tcPr>
+            <w:tcW w:w="0" w:type="auto"/>
+          </w:tcPr>
+          <w:p>
+            <w:r>
+              <w:t>Ordner Aufgabe4_Eigenschaften. Read-Only bei RegistriertAm, berechnete Werte bei Alter und Kosten, Datenvalidierung beim Kilometerstand, bei der E-Mail und bei der Dauer einer Fahrstunde.</w:t>
+            </w:r>
+          </w:p>
         </w:tc>
       </w:tr>
     </w:tbl>
@@ -1734,6 +1954,7 @@
       </w:pPr>
       <w:bookmarkStart w:id="13" w:name="c2-reflexion"/>
       <w:r>
+        <w:lastRenderedPageBreak/>
         <w:t>P3.2 Reflexion</w:t>
       </w:r>
       <w:bookmarkEnd w:id="13"/>
@@ -1743,30 +1964,46 @@
         <w:pStyle w:val="SourceCode0"/>
       </w:pPr>
       <w:r>
+        <w:rPr>
+          <w:b/>
+        </w:rPr>
         <w:t>Was war schwierig, und wie habe ich die Hürde gelöst?</w:t>
       </w:r>
       <w:r>
         <w:br/>
+        <w:t>Der Einstieg scheiterte zuerst an der Umgebung: Rider liess kein Projekt anlegen, weil kein .NET SDK installiert war. Nach der Installation und einem Neustart ging es. Danach haben wir den Code zuerst selbst getippt, was mehr Zeit brauchte als abschreiben, aber sichtbar machte, wo wir den Aufbau noch nicht verstanden hatten. Später haben wir den Datumstyp im ganzen Projekt auf DateTimeOffset umgestellt und dabei zwei Stellen übersehen, worauf der Build abbrach. Die Compilerfehler haben genau gezeigt, wo es klemmte. Am meisten Zeit kostete das UML-Diagramm, weil das Diagrammwerkzeug von Rider zuerst eine Fehlermeldung brachte und danach die Felder nicht anzeigte. Gelöst haben wir es, indem wir das Diagramm mit einem anderen Werkzeug direkt aus den Klassendateien erzeugt haben.</w:t>
       </w:r>
       <w:r>
         <w:br/>
       </w:r>
       <w:r>
         <w:br/>
+      </w:r>
+      <w:r>
+        <w:rPr>
+          <w:b/>
+        </w:rPr>
         <w:t>Was nehme ich ins nächste Thema mit?</w:t>
       </w:r>
       <w:r>
         <w:br/>
+        <w:t>Sobald ein Wert geprüft oder berechnet werden muss, nehmen wir von Anfang an eine Eigenschaft statt eines Feldes. Die Prüfung gehört in die Klasse und nicht in den Code, der sie benutzt. Ausserdem behalten wir im Kopf, dass bei Klassen nur die Adresse kopiert wird, wenn man ein Objekt einer zweiten Variable zuweist. Beibehalten wollen wir auch das gemeinsame Git-Repository, weil beide jederzeit denselben Stand sehen.</w:t>
       </w:r>
       <w:r>
         <w:br/>
       </w:r>
       <w:r>
         <w:br/>
+      </w:r>
+      <w:r>
+        <w:rPr>
+          <w:b/>
+        </w:rPr>
         <w:t>Wo hat mir KI geholfen - und wo hat sie mich in die Irre geführt?</w:t>
       </w:r>
       <w:r>
         <w:br/>
+        <w:t>Wir haben den Code bewusst zuerst selbst geschrieben und zum Laufen gebracht und die KI erst danach zum Gegencheck eingesetzt. In dieser Reihenfolge hat sie am meisten gebracht: beim Aufräumen der Namensgebung, beim Erklären des Unterschieds zwischen Feld und Eigenschaft und beim Eingrenzen der Compilerfehler. In die Irre geführt hat sie bei der Bedienung von Rider, denn der genannte Menüpunkt existierte so nicht, und die Zusage, dass sich die Felder im Diagramm einblenden lassen, stimmte nicht. Beim Umbau des Datumstyps hat sie ausserdem Code hinterlassen, der nicht mehr kompilierte. Daraus nehmen wir mit, dass Angaben zu Menüführung und Werkzeugen selbst nachgeprüft werden müssen und dass nach jeder grösseren Änderung ein Build gehört.</w:t>
       </w:r>
     </w:p>
     <w:p>
@@ -1775,7 +2012,6 @@
       </w:pPr>
       <w:bookmarkStart w:id="14" w:name="c3-selbsteinschätzung-danach"/>
       <w:r>
-        <w:lastRenderedPageBreak/>
         <w:t>P3.3 Selbsteinschätzung danach</w:t>
       </w:r>
       <w:bookmarkEnd w:id="14"/>
@@ -1804,6 +2040,16 @@
               <w:t>Mein Stand zum Thema (0 = gar nicht ... 5 = kann es anderen beibringen)</w:t>
             </w:r>
           </w:p>
+          <w:p>
+            <w:r>
+              <w:t>Luca</w:t>
+            </w:r>
+          </w:p>
+          <w:p>
+            <w:r>
+              <w:t>Kiril</w:t>
+            </w:r>
+          </w:p>
         </w:tc>
         <w:tc>
           <w:tcPr>
@@ -1818,6 +2064,16 @@
               <w:t>vorher: ___</w:t>
             </w:r>
           </w:p>
+          <w:p>
+            <w:r>
+              <w:t>4</w:t>
+            </w:r>
+          </w:p>
+          <w:p>
+            <w:r>
+              <w:t>2</w:t>
+            </w:r>
+          </w:p>
         </w:tc>
         <w:tc>
           <w:tcPr>
@@ -1832,6 +2088,16 @@
               <w:t>nachher: ___</w:t>
             </w:r>
           </w:p>
+          <w:p>
+            <w:r>
+              <w:t>4</w:t>
+            </w:r>
+          </w:p>
+          <w:p>
+            <w:r>
+              <w:t>3</w:t>
+            </w:r>
+          </w:p>
         </w:tc>
       </w:tr>
     </w:tbl>
@@ -1840,8 +2106,13 @@
         <w:rPr>
           <w:noProof/>
         </w:rPr>
-        <w:pict w14:anchorId="739FB619">
-          <v:rect id="_x0000_i1028" alt="" style="width:347pt;height:.05pt;mso-width-percent:0;mso-height-percent:0;mso-width-percent:0;mso-height-percent:0" o:hrpct="765" o:hralign="center" o:hrstd="t" o:hr="t"/>
+      </w:r>
+      <w:r>
+        <w:pict w14:anchorId="5F3D3ACD">
+          <v:rect id="Horizontal Line 4" o:spid="_x0000_s2051" style="width:303.55pt;height:.05pt;visibility:visible;mso-wrap-style:square;mso-left-percent:-10001;mso-top-percent:-10001;mso-position-horizontal:absolute;mso-position-horizontal-relative:char;mso-position-vertical:absolute;mso-position-vertical-relative:line;mso-left-percent:-10001;mso-top-percent:-10001;v-text-anchor:top" o:gfxdata="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" filled="f">
+            <o:lock v:ext="edit" rotation="t" aspectratio="t" verticies="t" text="t" shapetype="t"/>
+            <w10:anchorlock/>
+          </v:rect>
         </w:pict>
       </w:r>
     </w:p>
@@ -1995,6 +2266,7 @@
       <w:bookmarkStart w:id="15" w:name="für-den-dozenten-kurz-feedback"/>
       <w:bookmarkStart w:id="16" w:name="OLE_LINK2"/>
       <w:r>
+        <w:lastRenderedPageBreak/>
         <w:t>Für den Dozenten (Kurz-Feedback)</w:t>
       </w:r>
       <w:bookmarkEnd w:id="15"/>
@@ -2080,8 +2352,13 @@
         <w:rPr>
           <w:noProof/>
         </w:rPr>
-        <w:pict w14:anchorId="1391FA98">
-          <v:rect id="_x0000_i1029" alt="" style="width:347pt;height:.05pt;mso-width-percent:0;mso-height-percent:0;mso-width-percent:0;mso-height-percent:0" o:hrpct="765" o:hralign="center" o:hrstd="t" o:hr="t"/>
+      </w:r>
+      <w:r>
+        <w:pict w14:anchorId="5CF692A2">
+          <v:rect id="Horizontal Line 5" o:spid="_x0000_s2050" style="width:303.55pt;height:.05pt;visibility:visible;mso-wrap-style:square;mso-left-percent:-10001;mso-top-percent:-10001;mso-position-horizontal:absolute;mso-position-horizontal-relative:char;mso-position-vertical:absolute;mso-position-vertical-relative:line;mso-left-percent:-10001;mso-top-percent:-10001;v-text-anchor:top" o:gfxdata="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" filled="f">
+            <o:lock v:ext="edit" rotation="t" aspectratio="t" verticies="t" text="t" shapetype="t"/>
+            <w10:anchorlock/>
+          </v:rect>
         </w:pict>
       </w:r>
     </w:p>
@@ -2297,7 +2574,7 @@
 </file>
 
 <file path=word/endnotes.xml><?xml version="1.0" encoding="utf-8"?>
-<w:endnotes xmlns:wpc="http://schemas.microsoft.com/office/word/2010/wordprocessingCanvas" xmlns:cx="http://schemas.microsoft.com/office/drawing/2014/chartex" xmlns:cx1="http://schemas.microsoft.com/office/drawing/2015/9/8/chartex" xmlns:cx2="http://schemas.microsoft.com/office/drawing/2015/10/21/chartex" xmlns:cx3="http://schemas.microsoft.com/office/drawing/2016/5/9/chartex" xmlns:cx4="http://schemas.microsoft.com/office/drawing/2016/5/10/chartex" xmlns:cx5="http://schemas.microsoft.com/office/drawing/2016/5/11/chartex" xmlns:cx6="http://schemas.microsoft.com/office/drawing/2016/5/12/chartex" xmlns:cx7="http://schemas.microsoft.com/office/drawing/2016/5/13/chartex" xmlns:cx8="http://schemas.microsoft.com/office/drawing/2016/5/14/chartex" xmlns:mc="http://schemas.openxmlformats.org/markup-compatibility/2006" xmlns:aink="http://schemas.microsoft.com/office/drawing/2016/ink" xmlns:am3d="http://schemas.microsoft.com/office/drawing/2017/model3d" xmlns:o="urn:schemas-microsoft-com:office:office" xmlns:oel="http://schemas.microsoft.com/office/2019/extlst" xmlns:r="http://schemas.openxmlformats.org/officeDocument/2006/relationships" xmlns:m="http://schemas.openxmlformats.org/officeDocument/2006/math" xmlns:v="urn:schemas-microsoft-com:vml" xmlns:wp14="http://schemas.microsoft.com/office/word/2010/wordprocessingDrawing" xmlns:wp="http://schemas.openxmlformats.org/drawingml/2006/wordprocessingDrawing" xmlns:w10="urn:schemas-microsoft-com:office:word" xmlns:w="http://schemas.openxmlformats.org/wordprocessingml/2006/main" xmlns:w14="http://schemas.microsoft.com/office/word/2010/wordml" xmlns:w15="http://schemas.microsoft.com/office/word/2012/wordml" xmlns:w16cex="http://schemas.microsoft.com/office/word/2018/wordml/cex" xmlns:w16cid="http://schemas.microsoft.com/office/word/2016/wordml/cid" xmlns:w16="http://schemas.microsoft.com/office/word/2018/wordml" xmlns:w16du="http://schemas.microsoft.com/office/word/2023/wordml/word16du" xmlns:w16sdtdh="http://schemas.microsoft.com/office/word/2020/wordml/sdtdatahash" xmlns:w16sdtfl="http://schemas.microsoft.com/office/word/2024/wordml/sdtformatlock" xmlns:w16se="http://schemas.microsoft.com/office/word/2015/wordml/symex" xmlns:wpg="http://schemas.microsoft.com/office/word/2010/wordprocessingGroup" xmlns:wpi="http://schemas.microsoft.com/office/word/2010/wordprocessingInk" xmlns:wne="http://schemas.microsoft.com/office/word/2006/wordml" xmlns:wps="http://schemas.microsoft.com/office/word/2010/wordprocessingShape" mc:Ignorable="w14 w15 w16se w16cid w16 w16cex w16sdtdh w16sdtfl w16du wp14">
+<w:endnotes xmlns:wpc="http://schemas.microsoft.com/office/word/2010/wordprocessingCanvas" xmlns:cx="http://schemas.microsoft.com/office/drawing/2014/chartex" xmlns:cx1="http://schemas.microsoft.com/office/drawing/2015/9/8/chartex" xmlns:cx2="http://schemas.microsoft.com/office/drawing/2015/10/21/chartex" xmlns:cx3="http://schemas.microsoft.com/office/drawing/2016/5/9/chartex" xmlns:cx4="http://schemas.microsoft.com/office/drawing/2016/5/10/chartex" xmlns:cx5="http://schemas.microsoft.com/office/drawing/2016/5/11/chartex" xmlns:cx6="http://schemas.microsoft.com/office/drawing/2016/5/12/chartex" xmlns:cx7="http://schemas.microsoft.com/office/drawing/2016/5/13/chartex" xmlns:cx8="http://schemas.microsoft.com/office/drawing/2016/5/14/chartex" xmlns:mc="http://schemas.openxmlformats.org/markup-compatibility/2006" xmlns:m="http://schemas.openxmlformats.org/officeDocument/2006/math" xmlns:aink="http://schemas.microsoft.com/office/drawing/2016/ink" xmlns:am3d="http://schemas.microsoft.com/office/drawing/2017/model3d" xmlns:oel="http://schemas.microsoft.com/office/2019/extlst" xmlns:r="http://schemas.openxmlformats.org/officeDocument/2006/relationships" xmlns:wp14="http://schemas.microsoft.com/office/word/2010/wordprocessingDrawing" xmlns:wp="http://schemas.openxmlformats.org/drawingml/2006/wordprocessingDrawing" xmlns:wpg="http://schemas.microsoft.com/office/word/2010/wordprocessingGroup" xmlns:wpi="http://schemas.microsoft.com/office/word/2010/wordprocessingInk" xmlns:wps="http://schemas.microsoft.com/office/word/2010/wordprocessingShape" xmlns:o="urn:schemas-microsoft-com:office:office" xmlns:v="urn:schemas-microsoft-com:vml" xmlns:w10="urn:schemas-microsoft-com:office:word" xmlns:w="http://schemas.openxmlformats.org/wordprocessingml/2006/main" xmlns:w14="http://schemas.microsoft.com/office/word/2010/wordml" xmlns:w15="http://schemas.microsoft.com/office/word/2012/wordml" xmlns:w16cex="http://schemas.microsoft.com/office/word/2018/wordml/cex" xmlns:w16cid="http://schemas.microsoft.com/office/word/2016/wordml/cid" xmlns:w16="http://schemas.microsoft.com/office/word/2018/wordml" xmlns:w16sdtdh="http://schemas.microsoft.com/office/word/2020/wordml/sdtdatahash" xmlns:w16sdtfl="http://schemas.microsoft.com/office/word/2024/wordml/sdtformatlock" xmlns:w16se="http://schemas.microsoft.com/office/word/2015/wordml/symex" xmlns:w16du="http://schemas.microsoft.com/office/word/2023/wordml/word16du" xmlns:wne="http://schemas.microsoft.com/office/word/2006/wordml" mc:Ignorable="w14 w15 w16se w16cid w16 w16cex w16sdtdh w16sdtfl w16du wp14">
   <w:endnote w:type="separator" w:id="-1">
     <w:p>
       <w:pPr>
@@ -2322,7 +2599,7 @@
 </file>
 
 <file path=word/footer1.xml><?xml version="1.0" encoding="utf-8"?>
-<w:ftr xmlns:wpc="http://schemas.microsoft.com/office/word/2010/wordprocessingCanvas" xmlns:cx="http://schemas.microsoft.com/office/drawing/2014/chartex" xmlns:cx1="http://schemas.microsoft.com/office/drawing/2015/9/8/chartex" xmlns:cx2="http://schemas.microsoft.com/office/drawing/2015/10/21/chartex" xmlns:cx3="http://schemas.microsoft.com/office/drawing/2016/5/9/chartex" xmlns:cx4="http://schemas.microsoft.com/office/drawing/2016/5/10/chartex" xmlns:cx5="http://schemas.microsoft.com/office/drawing/2016/5/11/chartex" xmlns:cx6="http://schemas.microsoft.com/office/drawing/2016/5/12/chartex" xmlns:cx7="http://schemas.microsoft.com/office/drawing/2016/5/13/chartex" xmlns:cx8="http://schemas.microsoft.com/office/drawing/2016/5/14/chartex" xmlns:mc="http://schemas.openxmlformats.org/markup-compatibility/2006" xmlns:aink="http://schemas.microsoft.com/office/drawing/2016/ink" xmlns:am3d="http://schemas.microsoft.com/office/drawing/2017/model3d" xmlns:o="urn:schemas-microsoft-com:office:office" xmlns:oel="http://schemas.microsoft.com/office/2019/extlst" xmlns:r="http://schemas.openxmlformats.org/officeDocument/2006/relationships" xmlns:m="http://schemas.openxmlformats.org/officeDocument/2006/math" xmlns:v="urn:schemas-microsoft-com:vml" xmlns:wp14="http://schemas.microsoft.com/office/word/2010/wordprocessingDrawing" xmlns:wp="http://schemas.openxmlformats.org/drawingml/2006/wordprocessingDrawing" xmlns:w10="urn:schemas-microsoft-com:office:word" xmlns:w="http://schemas.openxmlformats.org/wordprocessingml/2006/main" xmlns:w14="http://schemas.microsoft.com/office/word/2010/wordml" xmlns:w15="http://schemas.microsoft.com/office/word/2012/wordml" xmlns:w16cex="http://schemas.microsoft.com/office/word/2018/wordml/cex" xmlns:w16cid="http://schemas.microsoft.com/office/word/2016/wordml/cid" xmlns:w16="http://schemas.microsoft.com/office/word/2018/wordml" xmlns:w16du="http://schemas.microsoft.com/office/word/2023/wordml/word16du" xmlns:w16sdtdh="http://schemas.microsoft.com/office/word/2020/wordml/sdtdatahash" xmlns:w16sdtfl="http://schemas.microsoft.com/office/word/2024/wordml/sdtformatlock" xmlns:w16se="http://schemas.microsoft.com/office/word/2015/wordml/symex" xmlns:wpg="http://schemas.microsoft.com/office/word/2010/wordprocessingGroup" xmlns:wpi="http://schemas.microsoft.com/office/word/2010/wordprocessingInk" xmlns:wne="http://schemas.microsoft.com/office/word/2006/wordml" xmlns:wps="http://schemas.microsoft.com/office/word/2010/wordprocessingShape" mc:Ignorable="w14 w15 w16se w16cid w16 w16cex w16sdtdh w16sdtfl w16du wp14">
+<w:ftr xmlns:wpc="http://schemas.microsoft.com/office/word/2010/wordprocessingCanvas" xmlns:cx="http://schemas.microsoft.com/office/drawing/2014/chartex" xmlns:cx1="http://schemas.microsoft.com/office/drawing/2015/9/8/chartex" xmlns:cx2="http://schemas.microsoft.com/office/drawing/2015/10/21/chartex" xmlns:cx3="http://schemas.microsoft.com/office/drawing/2016/5/9/chartex" xmlns:cx4="http://schemas.microsoft.com/office/drawing/2016/5/10/chartex" xmlns:cx5="http://schemas.microsoft.com/office/drawing/2016/5/11/chartex" xmlns:cx6="http://schemas.microsoft.com/office/drawing/2016/5/12/chartex" xmlns:cx7="http://schemas.microsoft.com/office/drawing/2016/5/13/chartex" xmlns:cx8="http://schemas.microsoft.com/office/drawing/2016/5/14/chartex" xmlns:mc="http://schemas.openxmlformats.org/markup-compatibility/2006" xmlns:m="http://schemas.openxmlformats.org/officeDocument/2006/math" xmlns:aink="http://schemas.microsoft.com/office/drawing/2016/ink" xmlns:am3d="http://schemas.microsoft.com/office/drawing/2017/model3d" xmlns:oel="http://schemas.microsoft.com/office/2019/extlst" xmlns:r="http://schemas.openxmlformats.org/officeDocument/2006/relationships" xmlns:wp14="http://schemas.microsoft.com/office/word/2010/wordprocessingDrawing" xmlns:wp="http://schemas.openxmlformats.org/drawingml/2006/wordprocessingDrawing" xmlns:wpg="http://schemas.microsoft.com/office/word/2010/wordprocessingGroup" xmlns:wpi="http://schemas.microsoft.com/office/word/2010/wordprocessingInk" xmlns:wps="http://schemas.microsoft.com/office/word/2010/wordprocessingShape" xmlns:o="urn:schemas-microsoft-com:office:office" xmlns:v="urn:schemas-microsoft-com:vml" xmlns:w10="urn:schemas-microsoft-com:office:word" xmlns:w="http://schemas.openxmlformats.org/wordprocessingml/2006/main" xmlns:w14="http://schemas.microsoft.com/office/word/2010/wordml" xmlns:w15="http://schemas.microsoft.com/office/word/2012/wordml" xmlns:w16cex="http://schemas.microsoft.com/office/word/2018/wordml/cex" xmlns:w16cid="http://schemas.microsoft.com/office/word/2016/wordml/cid" xmlns:w16="http://schemas.microsoft.com/office/word/2018/wordml" xmlns:w16sdtdh="http://schemas.microsoft.com/office/word/2020/wordml/sdtdatahash" xmlns:w16sdtfl="http://schemas.microsoft.com/office/word/2024/wordml/sdtformatlock" xmlns:w16se="http://schemas.microsoft.com/office/word/2015/wordml/symex" xmlns:w16du="http://schemas.microsoft.com/office/word/2023/wordml/word16du" xmlns:wne="http://schemas.microsoft.com/office/word/2006/wordml" mc:Ignorable="w14 w15 w16se w16cid w16 w16cex w16sdtdh w16sdtfl w16du wp14">
   <w:p>
     <w:pPr>
       <w:pStyle w:val="Fuzeile"/>
@@ -2340,7 +2617,7 @@
 </file>
 
 <file path=word/footnotes.xml><?xml version="1.0" encoding="utf-8"?>
-<w:footnotes xmlns:wpc="http://schemas.microsoft.com/office/word/2010/wordprocessingCanvas" xmlns:cx="http://schemas.microsoft.com/office/drawing/2014/chartex" xmlns:cx1="http://schemas.microsoft.com/office/drawing/2015/9/8/chartex" xmlns:cx2="http://schemas.microsoft.com/office/drawing/2015/10/21/chartex" xmlns:cx3="http://schemas.microsoft.com/office/drawing/2016/5/9/chartex" xmlns:cx4="http://schemas.microsoft.com/office/drawing/2016/5/10/chartex" xmlns:cx5="http://schemas.microsoft.com/office/drawing/2016/5/11/chartex" xmlns:cx6="http://schemas.microsoft.com/office/drawing/2016/5/12/chartex" xmlns:cx7="http://schemas.microsoft.com/office/drawing/2016/5/13/chartex" xmlns:cx8="http://schemas.microsoft.com/office/drawing/2016/5/14/chartex" xmlns:mc="http://schemas.openxmlformats.org/markup-compatibility/2006" xmlns:aink="http://schemas.microsoft.com/office/drawing/2016/ink" xmlns:am3d="http://schemas.microsoft.com/office/drawing/2017/model3d" xmlns:o="urn:schemas-microsoft-com:office:office" xmlns:oel="http://schemas.microsoft.com/office/2019/extlst" xmlns:r="http://schemas.openxmlformats.org/officeDocument/2006/relationships" xmlns:m="http://schemas.openxmlformats.org/officeDocument/2006/math" xmlns:v="urn:schemas-microsoft-com:vml" xmlns:wp14="http://schemas.microsoft.com/office/word/2010/wordprocessingDrawing" xmlns:wp="http://schemas.openxmlformats.org/drawingml/2006/wordprocessingDrawing" xmlns:w10="urn:schemas-microsoft-com:office:word" xmlns:w="http://schemas.openxmlformats.org/wordprocessingml/2006/main" xmlns:w14="http://schemas.microsoft.com/office/word/2010/wordml" xmlns:w15="http://schemas.microsoft.com/office/word/2012/wordml" xmlns:w16cex="http://schemas.microsoft.com/office/word/2018/wordml/cex" xmlns:w16cid="http://schemas.microsoft.com/office/word/2016/wordml/cid" xmlns:w16="http://schemas.microsoft.com/office/word/2018/wordml" xmlns:w16du="http://schemas.microsoft.com/office/word/2023/wordml/word16du" xmlns:w16sdtdh="http://schemas.microsoft.com/office/word/2020/wordml/sdtdatahash" xmlns:w16sdtfl="http://schemas.microsoft.com/office/word/2024/wordml/sdtformatlock" xmlns:w16se="http://schemas.microsoft.com/office/word/2015/wordml/symex" xmlns:wpg="http://schemas.microsoft.com/office/word/2010/wordprocessingGroup" xmlns:wpi="http://schemas.microsoft.com/office/word/2010/wordprocessingInk" xmlns:wne="http://schemas.microsoft.com/office/word/2006/wordml" xmlns:wps="http://schemas.microsoft.com/office/word/2010/wordprocessingShape" mc:Ignorable="w14 w15 w16se w16cid w16 w16cex w16sdtdh w16sdtfl w16du wp14">
+<w:footnotes xmlns:wpc="http://schemas.microsoft.com/office/word/2010/wordprocessingCanvas" xmlns:cx="http://schemas.microsoft.com/office/drawing/2014/chartex" xmlns:cx1="http://schemas.microsoft.com/office/drawing/2015/9/8/chartex" xmlns:cx2="http://schemas.microsoft.com/office/drawing/2015/10/21/chartex" xmlns:cx3="http://schemas.microsoft.com/office/drawing/2016/5/9/chartex" xmlns:cx4="http://schemas.microsoft.com/office/drawing/2016/5/10/chartex" xmlns:cx5="http://schemas.microsoft.com/office/drawing/2016/5/11/chartex" xmlns:cx6="http://schemas.microsoft.com/office/drawing/2016/5/12/chartex" xmlns:cx7="http://schemas.microsoft.com/office/drawing/2016/5/13/chartex" xmlns:cx8="http://schemas.microsoft.com/office/drawing/2016/5/14/chartex" xmlns:mc="http://schemas.openxmlformats.org/markup-compatibility/2006" xmlns:m="http://schemas.openxmlformats.org/officeDocument/2006/math" xmlns:aink="http://schemas.microsoft.com/office/drawing/2016/ink" xmlns:am3d="http://schemas.microsoft.com/office/drawing/2017/model3d" xmlns:oel="http://schemas.microsoft.com/office/2019/extlst" xmlns:r="http://schemas.openxmlformats.org/officeDocument/2006/relationships" xmlns:wp14="http://schemas.microsoft.com/office/word/2010/wordprocessingDrawing" xmlns:wp="http://schemas.openxmlformats.org/drawingml/2006/wordprocessingDrawing" xmlns:wpg="http://schemas.microsoft.com/office/word/2010/wordprocessingGroup" xmlns:wpi="http://schemas.microsoft.com/office/word/2010/wordprocessingInk" xmlns:wps="http://schemas.microsoft.com/office/word/2010/wordprocessingShape" xmlns:o="urn:schemas-microsoft-com:office:office" xmlns:v="urn:schemas-microsoft-com:vml" xmlns:w10="urn:schemas-microsoft-com:office:word" xmlns:w="http://schemas.openxmlformats.org/wordprocessingml/2006/main" xmlns:w14="http://schemas.microsoft.com/office/word/2010/wordml" xmlns:w15="http://schemas.microsoft.com/office/word/2012/wordml" xmlns:w16cex="http://schemas.microsoft.com/office/word/2018/wordml/cex" xmlns:w16cid="http://schemas.microsoft.com/office/word/2016/wordml/cid" xmlns:w16="http://schemas.microsoft.com/office/word/2018/wordml" xmlns:w16sdtdh="http://schemas.microsoft.com/office/word/2020/wordml/sdtdatahash" xmlns:w16sdtfl="http://schemas.microsoft.com/office/word/2024/wordml/sdtformatlock" xmlns:w16se="http://schemas.microsoft.com/office/word/2015/wordml/symex" xmlns:w16du="http://schemas.microsoft.com/office/word/2023/wordml/word16du" xmlns:wne="http://schemas.microsoft.com/office/word/2006/wordml" mc:Ignorable="w14 w15 w16se w16cid w16 w16cex w16sdtdh w16sdtfl w16du wp14">
   <w:footnote w:type="separator" w:id="-1">
     <w:p>
       <w:r>
@@ -2359,7 +2636,7 @@
 </file>
 
 <file path=word/header1.xml><?xml version="1.0" encoding="utf-8"?>
-<w:hdr xmlns:wpc="http://schemas.microsoft.com/office/word/2010/wordprocessingCanvas" xmlns:cx="http://schemas.microsoft.com/office/drawing/2014/chartex" xmlns:cx1="http://schemas.microsoft.com/office/drawing/2015/9/8/chartex" xmlns:cx2="http://schemas.microsoft.com/office/drawing/2015/10/21/chartex" xmlns:cx3="http://schemas.microsoft.com/office/drawing/2016/5/9/chartex" xmlns:cx4="http://schemas.microsoft.com/office/drawing/2016/5/10/chartex" xmlns:cx5="http://schemas.microsoft.com/office/drawing/2016/5/11/chartex" xmlns:cx6="http://schemas.microsoft.com/office/drawing/2016/5/12/chartex" xmlns:cx7="http://schemas.microsoft.com/office/drawing/2016/5/13/chartex" xmlns:cx8="http://schemas.microsoft.com/office/drawing/2016/5/14/chartex" xmlns:mc="http://schemas.openxmlformats.org/markup-compatibility/2006" xmlns:aink="http://schemas.microsoft.com/office/drawing/2016/ink" xmlns:am3d="http://schemas.microsoft.com/office/drawing/2017/model3d" xmlns:o="urn:schemas-microsoft-com:office:office" xmlns:oel="http://schemas.microsoft.com/office/2019/extlst" xmlns:r="http://schemas.openxmlformats.org/officeDocument/2006/relationships" xmlns:m="http://schemas.openxmlformats.org/officeDocument/2006/math" xmlns:v="urn:schemas-microsoft-com:vml" xmlns:wp14="http://schemas.microsoft.com/office/word/2010/wordprocessingDrawing" xmlns:wp="http://schemas.openxmlformats.org/drawingml/2006/wordprocessingDrawing" xmlns:w10="urn:schemas-microsoft-com:office:word" xmlns:w="http://schemas.openxmlformats.org/wordprocessingml/2006/main" xmlns:w14="http://schemas.microsoft.com/office/word/2010/wordml" xmlns:w15="http://schemas.microsoft.com/office/word/2012/wordml" xmlns:w16cex="http://schemas.microsoft.com/office/word/2018/wordml/cex" xmlns:w16cid="http://schemas.microsoft.com/office/word/2016/wordml/cid" xmlns:w16="http://schemas.microsoft.com/office/word/2018/wordml" xmlns:w16du="http://schemas.microsoft.com/office/word/2023/wordml/word16du" xmlns:w16sdtdh="http://schemas.microsoft.com/office/word/2020/wordml/sdtdatahash" xmlns:w16sdtfl="http://schemas.microsoft.com/office/word/2024/wordml/sdtformatlock" xmlns:w16se="http://schemas.microsoft.com/office/word/2015/wordml/symex" xmlns:wpg="http://schemas.microsoft.com/office/word/2010/wordprocessingGroup" xmlns:wpi="http://schemas.microsoft.com/office/word/2010/wordprocessingInk" xmlns:wne="http://schemas.microsoft.com/office/word/2006/wordml" xmlns:wps="http://schemas.microsoft.com/office/word/2010/wordprocessingShape" mc:Ignorable="w14 w15 w16se w16cid w16 w16cex w16sdtdh w16sdtfl w16du wp14">
+<w:hdr xmlns:wpc="http://schemas.microsoft.com/office/word/2010/wordprocessingCanvas" xmlns:cx="http://schemas.microsoft.com/office/drawing/2014/chartex" xmlns:cx1="http://schemas.microsoft.com/office/drawing/2015/9/8/chartex" xmlns:cx2="http://schemas.microsoft.com/office/drawing/2015/10/21/chartex" xmlns:cx3="http://schemas.microsoft.com/office/drawing/2016/5/9/chartex" xmlns:cx4="http://schemas.microsoft.com/office/drawing/2016/5/10/chartex" xmlns:cx5="http://schemas.microsoft.com/office/drawing/2016/5/11/chartex" xmlns:cx6="http://schemas.microsoft.com/office/drawing/2016/5/12/chartex" xmlns:cx7="http://schemas.microsoft.com/office/drawing/2016/5/13/chartex" xmlns:cx8="http://schemas.microsoft.com/office/drawing/2016/5/14/chartex" xmlns:mc="http://schemas.openxmlformats.org/markup-compatibility/2006" xmlns:m="http://schemas.openxmlformats.org/officeDocument/2006/math" xmlns:aink="http://schemas.microsoft.com/office/drawing/2016/ink" xmlns:am3d="http://schemas.microsoft.com/office/drawing/2017/model3d" xmlns:oel="http://schemas.microsoft.com/office/2019/extlst" xmlns:r="http://schemas.openxmlformats.org/officeDocument/2006/relationships" xmlns:wp14="http://schemas.microsoft.com/office/word/2010/wordprocessingDrawing" xmlns:wp="http://schemas.openxmlformats.org/drawingml/2006/wordprocessingDrawing" xmlns:wpg="http://schemas.microsoft.com/office/word/2010/wordprocessingGroup" xmlns:wpi="http://schemas.microsoft.com/office/word/2010/wordprocessingInk" xmlns:wps="http://schemas.microsoft.com/office/word/2010/wordprocessingShape" xmlns:o="urn:schemas-microsoft-com:office:office" xmlns:v="urn:schemas-microsoft-com:vml" xmlns:w10="urn:schemas-microsoft-com:office:word" xmlns:w="http://schemas.openxmlformats.org/wordprocessingml/2006/main" xmlns:w14="http://schemas.microsoft.com/office/word/2010/wordml" xmlns:w15="http://schemas.microsoft.com/office/word/2012/wordml" xmlns:w16cex="http://schemas.microsoft.com/office/word/2018/wordml/cex" xmlns:w16cid="http://schemas.microsoft.com/office/word/2016/wordml/cid" xmlns:w16="http://schemas.microsoft.com/office/word/2018/wordml" xmlns:w16sdtdh="http://schemas.microsoft.com/office/word/2020/wordml/sdtdatahash" xmlns:w16sdtfl="http://schemas.microsoft.com/office/word/2024/wordml/sdtformatlock" xmlns:w16se="http://schemas.microsoft.com/office/word/2015/wordml/symex" xmlns:w16du="http://schemas.microsoft.com/office/word/2023/wordml/word16du" xmlns:wne="http://schemas.microsoft.com/office/word/2006/wordml" mc:Ignorable="w14 w15 w16se w16cid w16 w16cex w16sdtdh w16sdtfl w16du wp14">
   <w:p>
     <w:pPr>
       <w:pStyle w:val="Kopfzeile"/>
@@ -2368,12 +2645,12 @@
       <w:rPr>
         <w:noProof/>
       </w:rPr>
-      <w:pict w14:anchorId="7E746FD9">
+      <w:pict w14:anchorId="55BF9678">
         <v:shapetype id="_x0000_t202" coordsize="21600,21600" o:spt="202" path="m,l,21600r21600,l21600,xe">
           <v:stroke joinstyle="miter"/>
           <v:path gradientshapeok="t" o:connecttype="rect"/>
         </v:shapetype>
-        <v:shape id="Textfeld 1" o:spid="_x0000_s1025" type="#_x0000_t202" style="position:absolute;margin-left:42.5pt;margin-top:-.05pt;width:99.2pt;height:138pt;z-index:251659264;visibility:visible;mso-wrap-style:square;mso-width-percent:0;mso-height-percent:0;mso-wrap-distance-left:9pt;mso-wrap-distance-top:0;mso-wrap-distance-right:9pt;mso-wrap-distance-bottom:0;mso-position-horizontal:absolute;mso-position-horizontal-relative:page;mso-position-vertical:absolute;mso-position-vertical-relative:margin;mso-width-percent:0;mso-height-percent:0;mso-width-relative:margin;mso-height-relative:margin;v-text-anchor:top" o:gfxdata="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" filled="f" stroked="f" strokeweight=".5pt">
+        <v:shape id="Textfeld 1" o:spid="_x0000_s1025" type="#_x0000_t202" style="position:absolute;margin-left:42.5pt;margin-top:-.05pt;width:99.2pt;height:138pt;z-index:251659264;visibility:visible;mso-wrap-style:square;mso-width-percent:0;mso-height-percent:0;mso-wrap-distance-left:9pt;mso-wrap-distance-top:0;mso-wrap-distance-right:9pt;mso-wrap-distance-bottom:0;mso-position-horizontal:absolute;mso-position-horizontal-relative:page;mso-position-vertical:absolute;mso-position-vertical-relative:margin;mso-width-percent:0;mso-height-percent:0;mso-width-relative:margin;mso-height-relative:margin;v-text-anchor:top" o:gfxdata="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" filled="f" stroked="f" strokeweight=".5pt">
           <v:textbox inset="0,0,0,0">
             <w:txbxContent>
               <w:sdt>
@@ -2519,7 +2796,7 @@
                     <w:rFonts w:asciiTheme="majorHAnsi" w:hAnsiTheme="majorHAnsi"/>
                     <w:noProof/>
                   </w:rPr>
-                  <w:t>6</w:t>
+                  <w:t>8</w:t>
                 </w:r>
                 <w:r>
                   <w:rPr>
@@ -2539,7 +2816,7 @@
 </file>
 
 <file path=word/numbering.xml><?xml version="1.0" encoding="utf-8"?>
-<w:numbering xmlns:wpc="http://schemas.microsoft.com/office/word/2010/wordprocessingCanvas" xmlns:cx="http://schemas.microsoft.com/office/drawing/2014/chartex" xmlns:cx1="http://schemas.microsoft.com/office/drawing/2015/9/8/chartex" xmlns:cx2="http://schemas.microsoft.com/office/drawing/2015/10/21/chartex" xmlns:cx3="http://schemas.microsoft.com/office/drawing/2016/5/9/chartex" xmlns:cx4="http://schemas.microsoft.com/office/drawing/2016/5/10/chartex" xmlns:cx5="http://schemas.microsoft.com/office/drawing/2016/5/11/chartex" xmlns:cx6="http://schemas.microsoft.com/office/drawing/2016/5/12/chartex" xmlns:cx7="http://schemas.microsoft.com/office/drawing/2016/5/13/chartex" xmlns:cx8="http://schemas.microsoft.com/office/drawing/2016/5/14/chartex" xmlns:mc="http://schemas.openxmlformats.org/markup-compatibility/2006" xmlns:aink="http://schemas.microsoft.com/office/drawing/2016/ink" xmlns:am3d="http://schemas.microsoft.com/office/drawing/2017/model3d" xmlns:o="urn:schemas-microsoft-com:office:office" xmlns:oel="http://schemas.microsoft.com/office/2019/extlst" xmlns:r="http://schemas.openxmlformats.org/officeDocument/2006/relationships" xmlns:m="http://schemas.openxmlformats.org/officeDocument/2006/math" xmlns:v="urn:schemas-microsoft-com:vml" xmlns:wp14="http://schemas.microsoft.com/office/word/2010/wordprocessingDrawing" xmlns:wp="http://schemas.openxmlformats.org/drawingml/2006/wordprocessingDrawing" xmlns:w10="urn:schemas-microsoft-com:office:word" xmlns:w="http://schemas.openxmlformats.org/wordprocessingml/2006/main" xmlns:w14="http://schemas.microsoft.com/office/word/2010/wordml" xmlns:w15="http://schemas.microsoft.com/office/word/2012/wordml" xmlns:w16cex="http://schemas.microsoft.com/office/word/2018/wordml/cex" xmlns:w16cid="http://schemas.microsoft.com/office/word/2016/wordml/cid" xmlns:w16="http://schemas.microsoft.com/office/word/2018/wordml" xmlns:w16du="http://schemas.microsoft.com/office/word/2023/wordml/word16du" xmlns:w16sdtdh="http://schemas.microsoft.com/office/word/2020/wordml/sdtdatahash" xmlns:w16sdtfl="http://schemas.microsoft.com/office/word/2024/wordml/sdtformatlock" xmlns:w16se="http://schemas.microsoft.com/office/word/2015/wordml/symex" xmlns:wpg="http://schemas.microsoft.com/office/word/2010/wordprocessingGroup" xmlns:wpi="http://schemas.microsoft.com/office/word/2010/wordprocessingInk" xmlns:wne="http://schemas.microsoft.com/office/word/2006/wordml" xmlns:wps="http://schemas.microsoft.com/office/word/2010/wordprocessingShape" mc:Ignorable="w14 w15 w16se w16cid w16 w16cex w16sdtdh w16sdtfl w16du wp14">
+<w:numbering xmlns:wpc="http://schemas.microsoft.com/office/word/2010/wordprocessingCanvas" xmlns:cx="http://schemas.microsoft.com/office/drawing/2014/chartex" xmlns:cx1="http://schemas.microsoft.com/office/drawing/2015/9/8/chartex" xmlns:cx2="http://schemas.microsoft.com/office/drawing/2015/10/21/chartex" xmlns:cx3="http://schemas.microsoft.com/office/drawing/2016/5/9/chartex" xmlns:cx4="http://schemas.microsoft.com/office/drawing/2016/5/10/chartex" xmlns:cx5="http://schemas.microsoft.com/office/drawing/2016/5/11/chartex" xmlns:cx6="http://schemas.microsoft.com/office/drawing/2016/5/12/chartex" xmlns:cx7="http://schemas.microsoft.com/office/drawing/2016/5/13/chartex" xmlns:cx8="http://schemas.microsoft.com/office/drawing/2016/5/14/chartex" xmlns:mc="http://schemas.openxmlformats.org/markup-compatibility/2006" xmlns:m="http://schemas.openxmlformats.org/officeDocument/2006/math" xmlns:aink="http://schemas.microsoft.com/office/drawing/2016/ink" xmlns:am3d="http://schemas.microsoft.com/office/drawing/2017/model3d" xmlns:oel="http://schemas.microsoft.com/office/2019/extlst" xmlns:r="http://schemas.openxmlformats.org/officeDocument/2006/relationships" xmlns:wp14="http://schemas.microsoft.com/office/word/2010/wordprocessingDrawing" xmlns:wp="http://schemas.openxmlformats.org/drawingml/2006/wordprocessingDrawing" xmlns:wpg="http://schemas.microsoft.com/office/word/2010/wordprocessingGroup" xmlns:wpi="http://schemas.microsoft.com/office/word/2010/wordprocessingInk" xmlns:wps="http://schemas.microsoft.com/office/word/2010/wordprocessingShape" xmlns:o="urn:schemas-microsoft-com:office:office" xmlns:v="urn:schemas-microsoft-com:vml" xmlns:w10="urn:schemas-microsoft-com:office:word" xmlns:w="http://schemas.openxmlformats.org/wordprocessingml/2006/main" xmlns:w14="http://schemas.microsoft.com/office/word/2010/wordml" xmlns:w15="http://schemas.microsoft.com/office/word/2012/wordml" xmlns:w16cex="http://schemas.microsoft.com/office/word/2018/wordml/cex" xmlns:w16cid="http://schemas.microsoft.com/office/word/2016/wordml/cid" xmlns:w16="http://schemas.microsoft.com/office/word/2018/wordml" xmlns:w16sdtdh="http://schemas.microsoft.com/office/word/2020/wordml/sdtdatahash" xmlns:w16sdtfl="http://schemas.microsoft.com/office/word/2024/wordml/sdtformatlock" xmlns:w16se="http://schemas.microsoft.com/office/word/2015/wordml/symex" xmlns:w16du="http://schemas.microsoft.com/office/word/2023/wordml/word16du" xmlns:wne="http://schemas.microsoft.com/office/word/2006/wordml" mc:Ignorable="w14 w15 w16se w16cid w16 w16cex w16sdtdh w16sdtfl w16du wp14">
   <w:abstractNum w:abstractNumId="0" w15:restartNumberingAfterBreak="0">
     <w:nsid w:val="EA454B4C"/>
     <w:multiLevelType w:val="multilevel"/>
@@ -4072,7 +4349,7 @@
 </file>
 
 <file path=word/styles.xml><?xml version="1.0" encoding="utf-8"?>
-<w:styles xmlns:mc="http://schemas.openxmlformats.org/markup-compatibility/2006" xmlns:r="http://schemas.openxmlformats.org/officeDocument/2006/relationships" xmlns:w="http://schemas.openxmlformats.org/wordprocessingml/2006/main" xmlns:w14="http://schemas.microsoft.com/office/word/2010/wordml" xmlns:w15="http://schemas.microsoft.com/office/word/2012/wordml" xmlns:w16cex="http://schemas.microsoft.com/office/word/2018/wordml/cex" xmlns:w16cid="http://schemas.microsoft.com/office/word/2016/wordml/cid" xmlns:w16="http://schemas.microsoft.com/office/word/2018/wordml" xmlns:w16du="http://schemas.microsoft.com/office/word/2023/wordml/word16du" xmlns:w16sdtdh="http://schemas.microsoft.com/office/word/2020/wordml/sdtdatahash" xmlns:w16sdtfl="http://schemas.microsoft.com/office/word/2024/wordml/sdtformatlock" xmlns:w16se="http://schemas.microsoft.com/office/word/2015/wordml/symex" mc:Ignorable="w14 w15 w16se w16cid w16 w16cex w16sdtdh w16sdtfl w16du">
+<w:styles xmlns:mc="http://schemas.openxmlformats.org/markup-compatibility/2006" xmlns:r="http://schemas.openxmlformats.org/officeDocument/2006/relationships" xmlns:w="http://schemas.openxmlformats.org/wordprocessingml/2006/main" xmlns:w14="http://schemas.microsoft.com/office/word/2010/wordml" xmlns:w15="http://schemas.microsoft.com/office/word/2012/wordml" xmlns:w16cex="http://schemas.microsoft.com/office/word/2018/wordml/cex" xmlns:w16cid="http://schemas.microsoft.com/office/word/2016/wordml/cid" xmlns:w16="http://schemas.microsoft.com/office/word/2018/wordml" xmlns:w16sdtdh="http://schemas.microsoft.com/office/word/2020/wordml/sdtdatahash" xmlns:w16sdtfl="http://schemas.microsoft.com/office/word/2024/wordml/sdtformatlock" xmlns:w16se="http://schemas.microsoft.com/office/word/2015/wordml/symex" xmlns:w16du="http://schemas.microsoft.com/office/word/2023/wordml/word16du" mc:Ignorable="w14 w15 w16se w16cid w16 w16cex w16sdtdh w16sdtfl w16du">
   <w:docDefaults>
     <w:rPrDefault>
       <w:rPr>

</xml_diff>